<commit_message>
Atualiza CORS e documentos acadêmicos
</commit_message>
<xml_diff>
--- a/docs/academico/Registro de Horas - Projeto de Extensão.docx
+++ b/docs/academico/Registro de Horas - Projeto de Extensão.docx
@@ -2026,6 +2026,1168 @@
           <w:lang w:val="pt-BR"/>
         </w:rPr>
       </w:pPr>
+    </w:p>
+    <w:p>
+      <w:pPr>
+        <w:spacing w:after="0"/>
+        <w:rPr>
+          <w:lang w:val="pt-BR"/>
+        </w:rPr>
+      </w:pPr>
+    </w:p>
+    <w:p>
+      <w:pPr>
+        <w:spacing w:after="0"/>
+        <w:rPr>
+          <w:rFonts w:ascii="Arial" w:hAnsi="Arial" w:cs="Arial"/>
+          <w:b/>
+          <w:bCs/>
+          <w:lang w:val="pt-BR"/>
+        </w:rPr>
+      </w:pPr>
+      <w:r>
+        <w:rPr>
+          <w:rFonts w:ascii="Arial" w:hAnsi="Arial" w:cs="Arial"/>
+          <w:b/>
+          <w:bCs/>
+          <w:lang w:val="pt-BR"/>
+        </w:rPr>
+        <w:t xml:space="preserve">Semana 10 (20/04 </w:t>
+      </w:r>
+      <w:r>
+        <w:rPr>
+          <w:rFonts w:ascii="Arial" w:hAnsi="Arial" w:cs="Arial"/>
+          <w:b/>
+          <w:bCs/>
+          <w:lang w:val="pt-BR"/>
+        </w:rPr>
+        <w:t>–</w:t>
+      </w:r>
+      <w:r>
+        <w:rPr>
+          <w:rFonts w:ascii="Arial" w:hAnsi="Arial" w:cs="Arial"/>
+          <w:b/>
+          <w:bCs/>
+          <w:lang w:val="pt-BR"/>
+        </w:rPr>
+        <w:t xml:space="preserve"> 26/04)</w:t>
+      </w:r>
+    </w:p>
+    <w:p>
+      <w:pPr>
+        <w:spacing w:after="0"/>
+        <w:rPr>
+          <w:rFonts w:ascii="Arial" w:hAnsi="Arial" w:cs="Arial"/>
+          <w:lang w:val="pt-BR"/>
+        </w:rPr>
+      </w:pPr>
+      <w:r>
+        <w:rPr>
+          <w:rFonts w:ascii="Arial" w:hAnsi="Arial" w:cs="Arial"/>
+          <w:lang w:val="pt-BR"/>
+        </w:rPr>
+        <w:t>Total de Horas Dedicadas: 15 horas</w:t>
+      </w:r>
+    </w:p>
+    <w:p>
+      <w:pPr>
+        <w:spacing w:after="0"/>
+        <w:rPr>
+          <w:rFonts w:ascii="Arial" w:hAnsi="Arial" w:cs="Arial"/>
+          <w:b/>
+          <w:bCs/>
+          <w:lang w:val="pt-BR"/>
+        </w:rPr>
+      </w:pPr>
+      <w:r>
+        <w:rPr>
+          <w:rFonts w:ascii="Arial" w:hAnsi="Arial" w:cs="Arial"/>
+          <w:b/>
+          <w:bCs/>
+          <w:lang w:val="pt-BR"/>
+        </w:rPr>
+        <w:t>Atividades Realizadas:</w:t>
+      </w:r>
+    </w:p>
+    <w:p>
+      <w:pPr>
+        <w:spacing w:after="0"/>
+        <w:rPr>
+          <w:rFonts w:ascii="Arial" w:hAnsi="Arial" w:cs="Arial"/>
+          <w:lang w:val="pt-BR"/>
+        </w:rPr>
+      </w:pPr>
+      <w:r>
+        <w:rPr>
+          <w:rFonts w:ascii="Arial" w:hAnsi="Arial" w:cs="Arial"/>
+          <w:lang w:val="pt-BR"/>
+        </w:rPr>
+        <w:t>Estrutura</w:t>
+      </w:r>
+      <w:r>
+        <w:rPr>
+          <w:rFonts w:ascii="Arial" w:hAnsi="Arial" w:cs="Arial"/>
+          <w:lang w:val="pt-BR"/>
+        </w:rPr>
+        <w:t>çã</w:t>
+      </w:r>
+      <w:r>
+        <w:rPr>
+          <w:rFonts w:ascii="Arial" w:hAnsi="Arial" w:cs="Arial"/>
+          <w:lang w:val="pt-BR"/>
+        </w:rPr>
+        <w:t>o base do frontend em React com TypeScript</w:t>
+      </w:r>
+      <w:r>
+        <w:rPr>
+          <w:rFonts w:ascii="Arial" w:hAnsi="Arial" w:cs="Arial"/>
+          <w:lang w:val="pt-BR"/>
+        </w:rPr>
+        <w:br/>
+        <w:t>Configura</w:t>
+      </w:r>
+      <w:r>
+        <w:rPr>
+          <w:rFonts w:ascii="Arial" w:hAnsi="Arial" w:cs="Arial"/>
+          <w:lang w:val="pt-BR"/>
+        </w:rPr>
+        <w:t>çã</w:t>
+      </w:r>
+      <w:r>
+        <w:rPr>
+          <w:rFonts w:ascii="Arial" w:hAnsi="Arial" w:cs="Arial"/>
+          <w:lang w:val="pt-BR"/>
+        </w:rPr>
+        <w:t>o das rotas principais da aplica</w:t>
+      </w:r>
+      <w:r>
+        <w:rPr>
+          <w:rFonts w:ascii="Arial" w:hAnsi="Arial" w:cs="Arial"/>
+          <w:lang w:val="pt-BR"/>
+        </w:rPr>
+        <w:t>çã</w:t>
+      </w:r>
+      <w:r>
+        <w:rPr>
+          <w:rFonts w:ascii="Arial" w:hAnsi="Arial" w:cs="Arial"/>
+          <w:lang w:val="pt-BR"/>
+        </w:rPr>
+        <w:t>o</w:t>
+      </w:r>
+      <w:r>
+        <w:rPr>
+          <w:rFonts w:ascii="Arial" w:hAnsi="Arial" w:cs="Arial"/>
+          <w:lang w:val="pt-BR"/>
+        </w:rPr>
+        <w:br/>
+      </w:r>
+      <w:r>
+        <w:rPr>
+          <w:rFonts w:ascii="Arial" w:hAnsi="Arial" w:cs="Arial"/>
+          <w:lang w:val="pt-BR"/>
+        </w:rPr>
+        <w:lastRenderedPageBreak/>
+        <w:t>Implementa</w:t>
+      </w:r>
+      <w:r>
+        <w:rPr>
+          <w:rFonts w:ascii="Arial" w:hAnsi="Arial" w:cs="Arial"/>
+          <w:lang w:val="pt-BR"/>
+        </w:rPr>
+        <w:t>çã</w:t>
+      </w:r>
+      <w:r>
+        <w:rPr>
+          <w:rFonts w:ascii="Arial" w:hAnsi="Arial" w:cs="Arial"/>
+          <w:lang w:val="pt-BR"/>
+        </w:rPr>
+        <w:t>o do layout principal e organiza</w:t>
+      </w:r>
+      <w:r>
+        <w:rPr>
+          <w:rFonts w:ascii="Arial" w:hAnsi="Arial" w:cs="Arial"/>
+          <w:lang w:val="pt-BR"/>
+        </w:rPr>
+        <w:t>çã</w:t>
+      </w:r>
+      <w:r>
+        <w:rPr>
+          <w:rFonts w:ascii="Arial" w:hAnsi="Arial" w:cs="Arial"/>
+          <w:lang w:val="pt-BR"/>
+        </w:rPr>
+        <w:t>o visual inicial</w:t>
+      </w:r>
+      <w:r>
+        <w:rPr>
+          <w:rFonts w:ascii="Arial" w:hAnsi="Arial" w:cs="Arial"/>
+          <w:lang w:val="pt-BR"/>
+        </w:rPr>
+        <w:br/>
+        <w:t>Estrutura</w:t>
+      </w:r>
+      <w:r>
+        <w:rPr>
+          <w:rFonts w:ascii="Arial" w:hAnsi="Arial" w:cs="Arial"/>
+          <w:lang w:val="pt-BR"/>
+        </w:rPr>
+        <w:t>çã</w:t>
+      </w:r>
+      <w:r>
+        <w:rPr>
+          <w:rFonts w:ascii="Arial" w:hAnsi="Arial" w:cs="Arial"/>
+          <w:lang w:val="pt-BR"/>
+        </w:rPr>
+        <w:t>o do fluxo de autentica</w:t>
+      </w:r>
+      <w:r>
+        <w:rPr>
+          <w:rFonts w:ascii="Arial" w:hAnsi="Arial" w:cs="Arial"/>
+          <w:lang w:val="pt-BR"/>
+        </w:rPr>
+        <w:t>çã</w:t>
+      </w:r>
+      <w:r>
+        <w:rPr>
+          <w:rFonts w:ascii="Arial" w:hAnsi="Arial" w:cs="Arial"/>
+          <w:lang w:val="pt-BR"/>
+        </w:rPr>
+        <w:t>o</w:t>
+      </w:r>
+      <w:r>
+        <w:rPr>
+          <w:rFonts w:ascii="Arial" w:hAnsi="Arial" w:cs="Arial"/>
+          <w:lang w:val="pt-BR"/>
+        </w:rPr>
+        <w:br/>
+        <w:t>Integra</w:t>
+      </w:r>
+      <w:r>
+        <w:rPr>
+          <w:rFonts w:ascii="Arial" w:hAnsi="Arial" w:cs="Arial"/>
+          <w:lang w:val="pt-BR"/>
+        </w:rPr>
+        <w:t>çã</w:t>
+      </w:r>
+      <w:r>
+        <w:rPr>
+          <w:rFonts w:ascii="Arial" w:hAnsi="Arial" w:cs="Arial"/>
+          <w:lang w:val="pt-BR"/>
+        </w:rPr>
+        <w:t xml:space="preserve">o inicial entre </w:t>
+      </w:r>
+      <w:proofErr w:type="spellStart"/>
+      <w:r>
+        <w:rPr>
+          <w:rFonts w:ascii="Arial" w:hAnsi="Arial" w:cs="Arial"/>
+          <w:lang w:val="pt-BR"/>
+        </w:rPr>
+        <w:t>frontend</w:t>
+      </w:r>
+      <w:proofErr w:type="spellEnd"/>
+      <w:r>
+        <w:rPr>
+          <w:rFonts w:ascii="Arial" w:hAnsi="Arial" w:cs="Arial"/>
+          <w:lang w:val="pt-BR"/>
+        </w:rPr>
+        <w:t xml:space="preserve"> e backend FastAPI</w:t>
+      </w:r>
+    </w:p>
+    <w:p>
+      <w:pPr>
+        <w:spacing w:after="0"/>
+        <w:rPr>
+          <w:rFonts w:ascii="Arial" w:hAnsi="Arial" w:cs="Arial"/>
+          <w:b/>
+          <w:bCs/>
+          <w:lang w:val="pt-BR"/>
+        </w:rPr>
+      </w:pPr>
+      <w:r>
+        <w:rPr>
+          <w:rFonts w:ascii="Arial" w:hAnsi="Arial" w:cs="Arial"/>
+          <w:b/>
+          <w:bCs/>
+          <w:lang w:val="pt-BR"/>
+        </w:rPr>
+        <w:t>Avan</w:t>
+      </w:r>
+      <w:r>
+        <w:rPr>
+          <w:rFonts w:ascii="Arial" w:hAnsi="Arial" w:cs="Arial"/>
+          <w:b/>
+          <w:bCs/>
+          <w:lang w:val="pt-BR"/>
+        </w:rPr>
+        <w:t>ç</w:t>
+      </w:r>
+      <w:r>
+        <w:rPr>
+          <w:rFonts w:ascii="Arial" w:hAnsi="Arial" w:cs="Arial"/>
+          <w:b/>
+          <w:bCs/>
+          <w:lang w:val="pt-BR"/>
+        </w:rPr>
+        <w:t>os do projeto:</w:t>
+      </w:r>
+    </w:p>
+    <w:p>
+      <w:pPr>
+        <w:spacing w:after="0"/>
+        <w:rPr>
+          <w:rFonts w:ascii="Arial" w:hAnsi="Arial" w:cs="Arial"/>
+          <w:lang w:val="pt-BR"/>
+        </w:rPr>
+      </w:pPr>
+      <w:r>
+        <w:rPr>
+          <w:rFonts w:ascii="Arial" w:hAnsi="Arial" w:cs="Arial"/>
+          <w:lang w:val="pt-BR"/>
+        </w:rPr>
+        <w:t>In</w:t>
+      </w:r>
+      <w:r>
+        <w:rPr>
+          <w:rFonts w:ascii="Arial" w:hAnsi="Arial" w:cs="Arial"/>
+          <w:lang w:val="pt-BR"/>
+        </w:rPr>
+        <w:t>í</w:t>
+      </w:r>
+      <w:r>
+        <w:rPr>
+          <w:rFonts w:ascii="Arial" w:hAnsi="Arial" w:cs="Arial"/>
+          <w:lang w:val="pt-BR"/>
+        </w:rPr>
+        <w:t>cio efetivo da implementa</w:t>
+      </w:r>
+      <w:r>
+        <w:rPr>
+          <w:rFonts w:ascii="Arial" w:hAnsi="Arial" w:cs="Arial"/>
+          <w:lang w:val="pt-BR"/>
+        </w:rPr>
+        <w:t>çã</w:t>
+      </w:r>
+      <w:r>
+        <w:rPr>
+          <w:rFonts w:ascii="Arial" w:hAnsi="Arial" w:cs="Arial"/>
+          <w:lang w:val="pt-BR"/>
+        </w:rPr>
+        <w:t>o do sistema, com base t</w:t>
+      </w:r>
+      <w:r>
+        <w:rPr>
+          <w:rFonts w:ascii="Arial" w:hAnsi="Arial" w:cs="Arial"/>
+          <w:lang w:val="pt-BR"/>
+        </w:rPr>
+        <w:t>é</w:t>
+      </w:r>
+      <w:r>
+        <w:rPr>
+          <w:rFonts w:ascii="Arial" w:hAnsi="Arial" w:cs="Arial"/>
+          <w:lang w:val="pt-BR"/>
+        </w:rPr>
+        <w:t>cnica funcional, navega</w:t>
+      </w:r>
+      <w:r>
+        <w:rPr>
+          <w:rFonts w:ascii="Arial" w:hAnsi="Arial" w:cs="Arial"/>
+          <w:lang w:val="pt-BR"/>
+        </w:rPr>
+        <w:t>çã</w:t>
+      </w:r>
+      <w:r>
+        <w:rPr>
+          <w:rFonts w:ascii="Arial" w:hAnsi="Arial" w:cs="Arial"/>
+          <w:lang w:val="pt-BR"/>
+        </w:rPr>
+        <w:t>o estruturada e primeiro fluxo de autentica</w:t>
+      </w:r>
+      <w:r>
+        <w:rPr>
+          <w:rFonts w:ascii="Arial" w:hAnsi="Arial" w:cs="Arial"/>
+          <w:lang w:val="pt-BR"/>
+        </w:rPr>
+        <w:t>çã</w:t>
+      </w:r>
+      <w:r>
+        <w:rPr>
+          <w:rFonts w:ascii="Arial" w:hAnsi="Arial" w:cs="Arial"/>
+          <w:lang w:val="pt-BR"/>
+        </w:rPr>
+        <w:t xml:space="preserve">o conectado </w:t>
+      </w:r>
+      <w:r>
+        <w:rPr>
+          <w:rFonts w:ascii="Arial" w:hAnsi="Arial" w:cs="Arial"/>
+          <w:lang w:val="pt-BR"/>
+        </w:rPr>
+        <w:t>à</w:t>
+      </w:r>
+      <w:r>
+        <w:rPr>
+          <w:rFonts w:ascii="Arial" w:hAnsi="Arial" w:cs="Arial"/>
+          <w:lang w:val="pt-BR"/>
+        </w:rPr>
+        <w:t xml:space="preserve"> API.</w:t>
+      </w:r>
+    </w:p>
+    <w:p>
+      <w:pPr>
+        <w:spacing w:after="0"/>
+        <w:rPr>
+          <w:lang w:val="pt-BR"/>
+        </w:rPr>
+      </w:pPr>
+    </w:p>
+    <w:p>
+      <w:pPr>
+        <w:spacing w:after="0"/>
+        <w:rPr>
+          <w:rFonts w:ascii="Arial" w:hAnsi="Arial" w:cs="Arial"/>
+          <w:b/>
+          <w:bCs/>
+          <w:lang w:val="pt-BR"/>
+        </w:rPr>
+      </w:pPr>
+      <w:r>
+        <w:rPr>
+          <w:rFonts w:ascii="Arial" w:hAnsi="Arial" w:cs="Arial"/>
+          <w:b/>
+          <w:bCs/>
+          <w:lang w:val="pt-BR"/>
+        </w:rPr>
+        <w:t xml:space="preserve">Semana 11 (27/04 </w:t>
+      </w:r>
+      <w:r>
+        <w:rPr>
+          <w:rFonts w:ascii="Arial" w:hAnsi="Arial" w:cs="Arial"/>
+          <w:b/>
+          <w:bCs/>
+          <w:lang w:val="pt-BR"/>
+        </w:rPr>
+        <w:t>–</w:t>
+      </w:r>
+      <w:r>
+        <w:rPr>
+          <w:rFonts w:ascii="Arial" w:hAnsi="Arial" w:cs="Arial"/>
+          <w:b/>
+          <w:bCs/>
+          <w:lang w:val="pt-BR"/>
+        </w:rPr>
+        <w:t xml:space="preserve"> 03/05)</w:t>
+      </w:r>
+    </w:p>
+    <w:p>
+      <w:pPr>
+        <w:spacing w:after="0"/>
+        <w:rPr>
+          <w:rFonts w:ascii="Arial" w:hAnsi="Arial" w:cs="Arial"/>
+          <w:lang w:val="pt-BR"/>
+        </w:rPr>
+      </w:pPr>
+      <w:r>
+        <w:rPr>
+          <w:rFonts w:ascii="Arial" w:hAnsi="Arial" w:cs="Arial"/>
+          <w:lang w:val="pt-BR"/>
+        </w:rPr>
+        <w:t>Total de Horas Dedicadas: 15 horas</w:t>
+      </w:r>
+    </w:p>
+    <w:p>
+      <w:pPr>
+        <w:spacing w:after="0"/>
+        <w:rPr>
+          <w:rFonts w:ascii="Arial" w:hAnsi="Arial" w:cs="Arial"/>
+          <w:b/>
+          <w:bCs/>
+          <w:lang w:val="pt-BR"/>
+        </w:rPr>
+      </w:pPr>
+      <w:r>
+        <w:rPr>
+          <w:rFonts w:ascii="Arial" w:hAnsi="Arial" w:cs="Arial"/>
+          <w:b/>
+          <w:bCs/>
+          <w:lang w:val="pt-BR"/>
+        </w:rPr>
+        <w:t>Atividades Realizadas:</w:t>
+      </w:r>
+    </w:p>
+    <w:p>
+      <w:pPr>
+        <w:spacing w:after="0"/>
+        <w:rPr>
+          <w:rFonts w:ascii="Arial" w:hAnsi="Arial" w:cs="Arial"/>
+          <w:lang w:val="pt-BR"/>
+        </w:rPr>
+      </w:pPr>
+      <w:r>
+        <w:rPr>
+          <w:rFonts w:ascii="Arial" w:hAnsi="Arial" w:cs="Arial"/>
+          <w:lang w:val="pt-BR"/>
+        </w:rPr>
+        <w:t>Implementa</w:t>
+      </w:r>
+      <w:r>
+        <w:rPr>
+          <w:rFonts w:ascii="Arial" w:hAnsi="Arial" w:cs="Arial"/>
+          <w:lang w:val="pt-BR"/>
+        </w:rPr>
+        <w:t>çã</w:t>
+      </w:r>
+      <w:r>
+        <w:rPr>
+          <w:rFonts w:ascii="Arial" w:hAnsi="Arial" w:cs="Arial"/>
+          <w:lang w:val="pt-BR"/>
+        </w:rPr>
+        <w:t>o do m</w:t>
+      </w:r>
+      <w:r>
+        <w:rPr>
+          <w:rFonts w:ascii="Arial" w:hAnsi="Arial" w:cs="Arial"/>
+          <w:lang w:val="pt-BR"/>
+        </w:rPr>
+        <w:t>ó</w:t>
+      </w:r>
+      <w:r>
+        <w:rPr>
+          <w:rFonts w:ascii="Arial" w:hAnsi="Arial" w:cs="Arial"/>
+          <w:lang w:val="pt-BR"/>
+        </w:rPr>
+        <w:t>dulo de usu</w:t>
+      </w:r>
+      <w:r>
+        <w:rPr>
+          <w:rFonts w:ascii="Arial" w:hAnsi="Arial" w:cs="Arial"/>
+          <w:lang w:val="pt-BR"/>
+        </w:rPr>
+        <w:t>á</w:t>
+      </w:r>
+      <w:r>
+        <w:rPr>
+          <w:rFonts w:ascii="Arial" w:hAnsi="Arial" w:cs="Arial"/>
+          <w:lang w:val="pt-BR"/>
+        </w:rPr>
+        <w:t>rios e tela de perfil</w:t>
+      </w:r>
+      <w:r>
+        <w:rPr>
+          <w:rFonts w:ascii="Arial" w:hAnsi="Arial" w:cs="Arial"/>
+          <w:lang w:val="pt-BR"/>
+        </w:rPr>
+        <w:br/>
+        <w:t>Implementa</w:t>
+      </w:r>
+      <w:r>
+        <w:rPr>
+          <w:rFonts w:ascii="Arial" w:hAnsi="Arial" w:cs="Arial"/>
+          <w:lang w:val="pt-BR"/>
+        </w:rPr>
+        <w:t>çã</w:t>
+      </w:r>
+      <w:r>
+        <w:rPr>
+          <w:rFonts w:ascii="Arial" w:hAnsi="Arial" w:cs="Arial"/>
+          <w:lang w:val="pt-BR"/>
+        </w:rPr>
+        <w:t>o do m</w:t>
+      </w:r>
+      <w:r>
+        <w:rPr>
+          <w:rFonts w:ascii="Arial" w:hAnsi="Arial" w:cs="Arial"/>
+          <w:lang w:val="pt-BR"/>
+        </w:rPr>
+        <w:t>ó</w:t>
+      </w:r>
+      <w:r>
+        <w:rPr>
+          <w:rFonts w:ascii="Arial" w:hAnsi="Arial" w:cs="Arial"/>
+          <w:lang w:val="pt-BR"/>
+        </w:rPr>
+        <w:t>dulo de clubes de leitura</w:t>
+      </w:r>
+      <w:r>
+        <w:rPr>
+          <w:rFonts w:ascii="Arial" w:hAnsi="Arial" w:cs="Arial"/>
+          <w:lang w:val="pt-BR"/>
+        </w:rPr>
+        <w:br/>
+        <w:t>Cri</w:t>
+      </w:r>
+      <w:r>
+        <w:rPr>
+          <w:rFonts w:ascii="Arial" w:hAnsi="Arial" w:cs="Arial"/>
+          <w:lang w:val="pt-BR"/>
+        </w:rPr>
+        <w:t>açã</w:t>
+      </w:r>
+      <w:r>
+        <w:rPr>
+          <w:rFonts w:ascii="Arial" w:hAnsi="Arial" w:cs="Arial"/>
+          <w:lang w:val="pt-BR"/>
+        </w:rPr>
+        <w:t>o e listagem de clubes</w:t>
+      </w:r>
+      <w:r>
+        <w:rPr>
+          <w:rFonts w:ascii="Arial" w:hAnsi="Arial" w:cs="Arial"/>
+          <w:lang w:val="pt-BR"/>
+        </w:rPr>
+        <w:br/>
+        <w:t>Estrutura</w:t>
+      </w:r>
+      <w:r>
+        <w:rPr>
+          <w:rFonts w:ascii="Arial" w:hAnsi="Arial" w:cs="Arial"/>
+          <w:lang w:val="pt-BR"/>
+        </w:rPr>
+        <w:t>çã</w:t>
+      </w:r>
+      <w:r>
+        <w:rPr>
+          <w:rFonts w:ascii="Arial" w:hAnsi="Arial" w:cs="Arial"/>
+          <w:lang w:val="pt-BR"/>
+        </w:rPr>
+        <w:t>o do ingresso de usu</w:t>
+      </w:r>
+      <w:r>
+        <w:rPr>
+          <w:rFonts w:ascii="Arial" w:hAnsi="Arial" w:cs="Arial"/>
+          <w:lang w:val="pt-BR"/>
+        </w:rPr>
+        <w:t>á</w:t>
+      </w:r>
+      <w:r>
+        <w:rPr>
+          <w:rFonts w:ascii="Arial" w:hAnsi="Arial" w:cs="Arial"/>
+          <w:lang w:val="pt-BR"/>
+        </w:rPr>
+        <w:t>rios em clubes</w:t>
+      </w:r>
+      <w:r>
+        <w:rPr>
+          <w:rFonts w:ascii="Arial" w:hAnsi="Arial" w:cs="Arial"/>
+          <w:lang w:val="pt-BR"/>
+        </w:rPr>
+        <w:br/>
+        <w:t>Defini</w:t>
+      </w:r>
+      <w:r>
+        <w:rPr>
+          <w:rFonts w:ascii="Arial" w:hAnsi="Arial" w:cs="Arial"/>
+          <w:lang w:val="pt-BR"/>
+        </w:rPr>
+        <w:t>çã</w:t>
+      </w:r>
+      <w:r>
+        <w:rPr>
+          <w:rFonts w:ascii="Arial" w:hAnsi="Arial" w:cs="Arial"/>
+          <w:lang w:val="pt-BR"/>
+        </w:rPr>
+        <w:t>o de permiss</w:t>
+      </w:r>
+      <w:r>
+        <w:rPr>
+          <w:rFonts w:ascii="Arial" w:hAnsi="Arial" w:cs="Arial"/>
+          <w:lang w:val="pt-BR"/>
+        </w:rPr>
+        <w:t>õ</w:t>
+      </w:r>
+      <w:r>
+        <w:rPr>
+          <w:rFonts w:ascii="Arial" w:hAnsi="Arial" w:cs="Arial"/>
+          <w:lang w:val="pt-BR"/>
+        </w:rPr>
+        <w:t>es b</w:t>
+      </w:r>
+      <w:r>
+        <w:rPr>
+          <w:rFonts w:ascii="Arial" w:hAnsi="Arial" w:cs="Arial"/>
+          <w:lang w:val="pt-BR"/>
+        </w:rPr>
+        <w:t>á</w:t>
+      </w:r>
+      <w:r>
+        <w:rPr>
+          <w:rFonts w:ascii="Arial" w:hAnsi="Arial" w:cs="Arial"/>
+          <w:lang w:val="pt-BR"/>
+        </w:rPr>
+        <w:t>sicas para administrador e membro</w:t>
+      </w:r>
+    </w:p>
+    <w:p>
+      <w:pPr>
+        <w:rPr>
+          <w:rFonts w:ascii="Arial" w:hAnsi="Arial" w:cs="Arial"/>
+          <w:b/>
+          <w:bCs/>
+          <w:lang w:val="pt-BR"/>
+        </w:rPr>
+      </w:pPr>
+      <w:r>
+        <w:rPr>
+          <w:rFonts w:ascii="Arial" w:hAnsi="Arial" w:cs="Arial"/>
+          <w:b/>
+          <w:bCs/>
+          <w:lang w:val="pt-BR"/>
+        </w:rPr>
+        <w:t>Avan</w:t>
+      </w:r>
+      <w:r>
+        <w:rPr>
+          <w:rFonts w:ascii="Arial" w:hAnsi="Arial" w:cs="Arial"/>
+          <w:b/>
+          <w:bCs/>
+          <w:lang w:val="pt-BR"/>
+        </w:rPr>
+        <w:t>ç</w:t>
+      </w:r>
+      <w:r>
+        <w:rPr>
+          <w:rFonts w:ascii="Arial" w:hAnsi="Arial" w:cs="Arial"/>
+          <w:b/>
+          <w:bCs/>
+          <w:lang w:val="pt-BR"/>
+        </w:rPr>
+        <w:t>os do projeto:</w:t>
+      </w:r>
+    </w:p>
+    <w:p>
+      <w:pPr>
+        <w:spacing w:after="0"/>
+        <w:rPr>
+          <w:rFonts w:ascii="Arial" w:hAnsi="Arial" w:cs="Arial"/>
+          <w:lang w:val="pt-BR"/>
+        </w:rPr>
+      </w:pPr>
+      <w:r>
+        <w:rPr>
+          <w:rFonts w:ascii="Arial" w:hAnsi="Arial" w:cs="Arial"/>
+          <w:lang w:val="pt-BR"/>
+        </w:rPr>
+        <w:t>Amplia</w:t>
+      </w:r>
+      <w:r>
+        <w:rPr>
+          <w:rFonts w:ascii="Arial" w:hAnsi="Arial" w:cs="Arial"/>
+          <w:lang w:val="pt-BR"/>
+        </w:rPr>
+        <w:t>çã</w:t>
+      </w:r>
+      <w:r>
+        <w:rPr>
+          <w:rFonts w:ascii="Arial" w:hAnsi="Arial" w:cs="Arial"/>
+          <w:lang w:val="pt-BR"/>
+        </w:rPr>
+        <w:t>o dos fluxos principais do MVP, permitindo autentica</w:t>
+      </w:r>
+      <w:r>
+        <w:rPr>
+          <w:rFonts w:ascii="Arial" w:hAnsi="Arial" w:cs="Arial"/>
+          <w:lang w:val="pt-BR"/>
+        </w:rPr>
+        <w:t>çã</w:t>
+      </w:r>
+      <w:r>
+        <w:rPr>
+          <w:rFonts w:ascii="Arial" w:hAnsi="Arial" w:cs="Arial"/>
+          <w:lang w:val="pt-BR"/>
+        </w:rPr>
+        <w:t>o do usu</w:t>
+      </w:r>
+      <w:r>
+        <w:rPr>
+          <w:rFonts w:ascii="Arial" w:hAnsi="Arial" w:cs="Arial"/>
+          <w:lang w:val="pt-BR"/>
+        </w:rPr>
+        <w:t>á</w:t>
+      </w:r>
+      <w:r>
+        <w:rPr>
+          <w:rFonts w:ascii="Arial" w:hAnsi="Arial" w:cs="Arial"/>
+          <w:lang w:val="pt-BR"/>
+        </w:rPr>
+        <w:t>rio, visualiza</w:t>
+      </w:r>
+      <w:r>
+        <w:rPr>
+          <w:rFonts w:ascii="Arial" w:hAnsi="Arial" w:cs="Arial"/>
+          <w:lang w:val="pt-BR"/>
+        </w:rPr>
+        <w:t>çã</w:t>
+      </w:r>
+      <w:r>
+        <w:rPr>
+          <w:rFonts w:ascii="Arial" w:hAnsi="Arial" w:cs="Arial"/>
+          <w:lang w:val="pt-BR"/>
+        </w:rPr>
+        <w:t>o de perfil e intera</w:t>
+      </w:r>
+      <w:r>
+        <w:rPr>
+          <w:rFonts w:ascii="Arial" w:hAnsi="Arial" w:cs="Arial"/>
+          <w:lang w:val="pt-BR"/>
+        </w:rPr>
+        <w:t>çã</w:t>
+      </w:r>
+      <w:r>
+        <w:rPr>
+          <w:rFonts w:ascii="Arial" w:hAnsi="Arial" w:cs="Arial"/>
+          <w:lang w:val="pt-BR"/>
+        </w:rPr>
+        <w:t>o inicial com clubes de leitura.</w:t>
+      </w:r>
+    </w:p>
+    <w:p>
+      <w:pPr>
+        <w:spacing w:after="0"/>
+        <w:rPr>
+          <w:lang w:val="pt-BR"/>
+        </w:rPr>
+      </w:pPr>
+    </w:p>
+    <w:p>
+      <w:pPr>
+        <w:spacing w:after="0"/>
+        <w:rPr>
+          <w:rFonts w:ascii="Arial" w:hAnsi="Arial" w:cs="Arial"/>
+          <w:b/>
+          <w:bCs/>
+          <w:lang w:val="pt-BR"/>
+        </w:rPr>
+      </w:pPr>
+      <w:r>
+        <w:rPr>
+          <w:rFonts w:ascii="Arial" w:hAnsi="Arial" w:cs="Arial"/>
+          <w:b/>
+          <w:bCs/>
+          <w:lang w:val="pt-BR"/>
+        </w:rPr>
+        <w:t xml:space="preserve">Semana 12 (04/05 </w:t>
+      </w:r>
+      <w:r>
+        <w:rPr>
+          <w:rFonts w:ascii="Arial" w:hAnsi="Arial" w:cs="Arial"/>
+          <w:b/>
+          <w:bCs/>
+          <w:lang w:val="pt-BR"/>
+        </w:rPr>
+        <w:t>–</w:t>
+      </w:r>
+      <w:r>
+        <w:rPr>
+          <w:rFonts w:ascii="Arial" w:hAnsi="Arial" w:cs="Arial"/>
+          <w:b/>
+          <w:bCs/>
+          <w:lang w:val="pt-BR"/>
+        </w:rPr>
+        <w:t xml:space="preserve"> 10/05)</w:t>
+      </w:r>
+    </w:p>
+    <w:p>
+      <w:pPr>
+        <w:spacing w:after="0"/>
+        <w:rPr>
+          <w:rFonts w:ascii="Arial" w:hAnsi="Arial" w:cs="Arial"/>
+          <w:lang w:val="pt-BR"/>
+        </w:rPr>
+      </w:pPr>
+      <w:r>
+        <w:rPr>
+          <w:rFonts w:ascii="Arial" w:hAnsi="Arial" w:cs="Arial"/>
+          <w:lang w:val="pt-BR"/>
+        </w:rPr>
+        <w:t>Total de Horas Dedicadas: 15 horas</w:t>
+      </w:r>
+    </w:p>
+    <w:p>
+      <w:pPr>
+        <w:spacing w:after="0"/>
+        <w:rPr>
+          <w:rFonts w:ascii="Arial" w:hAnsi="Arial" w:cs="Arial"/>
+          <w:b/>
+          <w:bCs/>
+          <w:lang w:val="pt-BR"/>
+        </w:rPr>
+      </w:pPr>
+      <w:r>
+        <w:rPr>
+          <w:rFonts w:ascii="Arial" w:hAnsi="Arial" w:cs="Arial"/>
+          <w:b/>
+          <w:bCs/>
+          <w:lang w:val="pt-BR"/>
+        </w:rPr>
+        <w:t>Atividades Realizadas:</w:t>
+      </w:r>
+    </w:p>
+    <w:p>
+      <w:pPr>
+        <w:spacing w:after="0"/>
+        <w:rPr>
+          <w:rFonts w:ascii="Arial" w:hAnsi="Arial" w:cs="Arial"/>
+          <w:lang w:val="pt-BR"/>
+        </w:rPr>
+      </w:pPr>
+      <w:r>
+        <w:rPr>
+          <w:rFonts w:ascii="Arial" w:hAnsi="Arial" w:cs="Arial"/>
+          <w:lang w:val="pt-BR"/>
+        </w:rPr>
+        <w:t>Implementa</w:t>
+      </w:r>
+      <w:r>
+        <w:rPr>
+          <w:rFonts w:ascii="Arial" w:hAnsi="Arial" w:cs="Arial"/>
+          <w:lang w:val="pt-BR"/>
+        </w:rPr>
+        <w:t>çã</w:t>
+      </w:r>
+      <w:r>
+        <w:rPr>
+          <w:rFonts w:ascii="Arial" w:hAnsi="Arial" w:cs="Arial"/>
+          <w:lang w:val="pt-BR"/>
+        </w:rPr>
+        <w:t>o do m</w:t>
+      </w:r>
+      <w:r>
+        <w:rPr>
+          <w:rFonts w:ascii="Arial" w:hAnsi="Arial" w:cs="Arial"/>
+          <w:lang w:val="pt-BR"/>
+        </w:rPr>
+        <w:t>ó</w:t>
+      </w:r>
+      <w:r>
+        <w:rPr>
+          <w:rFonts w:ascii="Arial" w:hAnsi="Arial" w:cs="Arial"/>
+          <w:lang w:val="pt-BR"/>
+        </w:rPr>
+        <w:t>dulo de livros</w:t>
+      </w:r>
+      <w:r>
+        <w:rPr>
+          <w:rFonts w:ascii="Arial" w:hAnsi="Arial" w:cs="Arial"/>
+          <w:lang w:val="pt-BR"/>
+        </w:rPr>
+        <w:br/>
+        <w:t>Cadastro e listagem de livros vinculados aos clubes</w:t>
+      </w:r>
+      <w:r>
+        <w:rPr>
+          <w:rFonts w:ascii="Arial" w:hAnsi="Arial" w:cs="Arial"/>
+          <w:lang w:val="pt-BR"/>
+        </w:rPr>
+        <w:br/>
+        <w:t>Implementa</w:t>
+      </w:r>
+      <w:r>
+        <w:rPr>
+          <w:rFonts w:ascii="Arial" w:hAnsi="Arial" w:cs="Arial"/>
+          <w:lang w:val="pt-BR"/>
+        </w:rPr>
+        <w:t>çã</w:t>
+      </w:r>
+      <w:r>
+        <w:rPr>
+          <w:rFonts w:ascii="Arial" w:hAnsi="Arial" w:cs="Arial"/>
+          <w:lang w:val="pt-BR"/>
+        </w:rPr>
+        <w:t>o do hist</w:t>
+      </w:r>
+      <w:r>
+        <w:rPr>
+          <w:rFonts w:ascii="Arial" w:hAnsi="Arial" w:cs="Arial"/>
+          <w:lang w:val="pt-BR"/>
+        </w:rPr>
+        <w:t>ó</w:t>
+      </w:r>
+      <w:r>
+        <w:rPr>
+          <w:rFonts w:ascii="Arial" w:hAnsi="Arial" w:cs="Arial"/>
+          <w:lang w:val="pt-BR"/>
+        </w:rPr>
+        <w:t>rico de leituras conclu</w:t>
+      </w:r>
+      <w:r>
+        <w:rPr>
+          <w:rFonts w:ascii="Arial" w:hAnsi="Arial" w:cs="Arial"/>
+          <w:lang w:val="pt-BR"/>
+        </w:rPr>
+        <w:t>í</w:t>
+      </w:r>
+      <w:r>
+        <w:rPr>
+          <w:rFonts w:ascii="Arial" w:hAnsi="Arial" w:cs="Arial"/>
+          <w:lang w:val="pt-BR"/>
+        </w:rPr>
+        <w:t>das</w:t>
+      </w:r>
+      <w:r>
+        <w:rPr>
+          <w:rFonts w:ascii="Arial" w:hAnsi="Arial" w:cs="Arial"/>
+          <w:lang w:val="pt-BR"/>
+        </w:rPr>
+        <w:br/>
+        <w:t>Ajustes de navega</w:t>
+      </w:r>
+      <w:r>
+        <w:rPr>
+          <w:rFonts w:ascii="Arial" w:hAnsi="Arial" w:cs="Arial"/>
+          <w:lang w:val="pt-BR"/>
+        </w:rPr>
+        <w:t>çã</w:t>
+      </w:r>
+      <w:r>
+        <w:rPr>
+          <w:rFonts w:ascii="Arial" w:hAnsi="Arial" w:cs="Arial"/>
+          <w:lang w:val="pt-BR"/>
+        </w:rPr>
+        <w:t>o entre dashboard, clubes e livros</w:t>
+      </w:r>
+      <w:r>
+        <w:rPr>
+          <w:rFonts w:ascii="Arial" w:hAnsi="Arial" w:cs="Arial"/>
+          <w:lang w:val="pt-BR"/>
+        </w:rPr>
+        <w:br/>
+        <w:t>Valida</w:t>
+      </w:r>
+      <w:r>
+        <w:rPr>
+          <w:rFonts w:ascii="Arial" w:hAnsi="Arial" w:cs="Arial"/>
+          <w:lang w:val="pt-BR"/>
+        </w:rPr>
+        <w:t>çã</w:t>
+      </w:r>
+      <w:r>
+        <w:rPr>
+          <w:rFonts w:ascii="Arial" w:hAnsi="Arial" w:cs="Arial"/>
+          <w:lang w:val="pt-BR"/>
+        </w:rPr>
+        <w:t>o dos usu</w:t>
+      </w:r>
+      <w:r>
+        <w:rPr>
+          <w:rFonts w:ascii="Arial" w:hAnsi="Arial" w:cs="Arial"/>
+          <w:lang w:val="pt-BR"/>
+        </w:rPr>
+        <w:t>á</w:t>
+      </w:r>
+      <w:r>
+        <w:rPr>
+          <w:rFonts w:ascii="Arial" w:hAnsi="Arial" w:cs="Arial"/>
+          <w:lang w:val="pt-BR"/>
+        </w:rPr>
+        <w:t>rios de teste e dos dados iniciais da aplica</w:t>
+      </w:r>
+      <w:r>
+        <w:rPr>
+          <w:rFonts w:ascii="Arial" w:hAnsi="Arial" w:cs="Arial"/>
+          <w:lang w:val="pt-BR"/>
+        </w:rPr>
+        <w:t>çã</w:t>
+      </w:r>
+      <w:r>
+        <w:rPr>
+          <w:rFonts w:ascii="Arial" w:hAnsi="Arial" w:cs="Arial"/>
+          <w:lang w:val="pt-BR"/>
+        </w:rPr>
+        <w:t>o</w:t>
+      </w:r>
+    </w:p>
+    <w:p>
+      <w:pPr>
+        <w:spacing w:after="0"/>
+        <w:rPr>
+          <w:rFonts w:ascii="Arial" w:hAnsi="Arial" w:cs="Arial"/>
+          <w:b/>
+          <w:bCs/>
+          <w:lang w:val="pt-BR"/>
+        </w:rPr>
+      </w:pPr>
+      <w:r>
+        <w:rPr>
+          <w:rFonts w:ascii="Arial" w:hAnsi="Arial" w:cs="Arial"/>
+          <w:b/>
+          <w:bCs/>
+          <w:lang w:val="pt-BR"/>
+        </w:rPr>
+        <w:t>Avan</w:t>
+      </w:r>
+      <w:r>
+        <w:rPr>
+          <w:rFonts w:ascii="Arial" w:hAnsi="Arial" w:cs="Arial"/>
+          <w:b/>
+          <w:bCs/>
+          <w:lang w:val="pt-BR"/>
+        </w:rPr>
+        <w:t>ç</w:t>
+      </w:r>
+      <w:r>
+        <w:rPr>
+          <w:rFonts w:ascii="Arial" w:hAnsi="Arial" w:cs="Arial"/>
+          <w:b/>
+          <w:bCs/>
+          <w:lang w:val="pt-BR"/>
+        </w:rPr>
+        <w:t>os do projeto:</w:t>
+      </w:r>
+    </w:p>
+    <w:p>
+      <w:pPr>
+        <w:spacing w:after="0"/>
+        <w:rPr>
+          <w:rFonts w:ascii="Arial" w:hAnsi="Arial" w:cs="Arial"/>
+          <w:lang w:val="pt-BR"/>
+        </w:rPr>
+      </w:pPr>
+      <w:r>
+        <w:rPr>
+          <w:rFonts w:ascii="Arial" w:hAnsi="Arial" w:cs="Arial"/>
+          <w:lang w:val="pt-BR"/>
+        </w:rPr>
+        <w:t>Consolida</w:t>
+      </w:r>
+      <w:r>
+        <w:rPr>
+          <w:rFonts w:ascii="Arial" w:hAnsi="Arial" w:cs="Arial"/>
+          <w:lang w:val="pt-BR"/>
+        </w:rPr>
+        <w:t>çã</w:t>
+      </w:r>
+      <w:r>
+        <w:rPr>
+          <w:rFonts w:ascii="Arial" w:hAnsi="Arial" w:cs="Arial"/>
+          <w:lang w:val="pt-BR"/>
+        </w:rPr>
+        <w:t>o do fluxo de leitura do MVP, com clubes, livros, hist</w:t>
+      </w:r>
+      <w:r>
+        <w:rPr>
+          <w:rFonts w:ascii="Arial" w:hAnsi="Arial" w:cs="Arial"/>
+          <w:lang w:val="pt-BR"/>
+        </w:rPr>
+        <w:t>ó</w:t>
+      </w:r>
+      <w:r>
+        <w:rPr>
+          <w:rFonts w:ascii="Arial" w:hAnsi="Arial" w:cs="Arial"/>
+          <w:lang w:val="pt-BR"/>
+        </w:rPr>
+        <w:t>rico e navega</w:t>
+      </w:r>
+      <w:r>
+        <w:rPr>
+          <w:rFonts w:ascii="Arial" w:hAnsi="Arial" w:cs="Arial"/>
+          <w:lang w:val="pt-BR"/>
+        </w:rPr>
+        <w:t>çã</w:t>
+      </w:r>
+      <w:r>
+        <w:rPr>
+          <w:rFonts w:ascii="Arial" w:hAnsi="Arial" w:cs="Arial"/>
+          <w:lang w:val="pt-BR"/>
+        </w:rPr>
+        <w:t>o integrada entre as principais telas da plataforma.</w:t>
+      </w:r>
     </w:p>
     <w:sectPr>
       <w:pgSz w:w="12240" w:h="15840"/>
@@ -3075,6 +4237,7 @@
   <w:style w:type="character" w:default="1" w:styleId="Fontepargpadro">
     <w:name w:val="Default Paragraph Font"/>
     <w:uiPriority w:val="1"/>
+    <w:semiHidden/>
     <w:unhideWhenUsed/>
   </w:style>
   <w:style w:type="table" w:default="1" w:styleId="Tabelanormal">

</xml_diff>

<commit_message>
docs: atualizar semanas 13 e 14 do projeto
</commit_message>
<xml_diff>
--- a/docs/academico/Registro de Horas - Projeto de Extensão.docx
+++ b/docs/academico/Registro de Horas - Projeto de Extensão.docx
@@ -3187,6 +3187,78 @@
           <w:lang w:val="pt-BR"/>
         </w:rPr>
         <w:t>o integrada entre as principais telas da plataforma.</w:t>
+      </w:r>
+    </w:p>
+    <w:p>
+      <w:pPr/>
+      <w:r>
+        <w:t>Semana 13 (11/05 ? 17/05)</w:t>
+      </w:r>
+    </w:p>
+    <w:p>
+      <w:pPr/>
+      <w:r>
+        <w:t>Total de Horas Dedicadas: 18 horas</w:t>
+      </w:r>
+    </w:p>
+    <w:p>
+      <w:pPr/>
+      <w:r>
+        <w:t>Atividades Realizadas:</w:t>
+      </w:r>
+    </w:p>
+    <w:p>
+      <w:pPr/>
+      <w:r>
+        <w:t>Implementa??o do m?dulo de encontros Cria??o e listagem de encontros por clube Estrutura??o do v?nculo entre encontro e livro Implementa??o do sistema de coment?rios simples para livros e encontros Integra??o entre detalhes do clube, detalhes do livro e ?rea de encontros</w:t>
+      </w:r>
+    </w:p>
+    <w:p>
+      <w:pPr/>
+      <w:r>
+        <w:t>Avan?os do projeto:</w:t>
+      </w:r>
+    </w:p>
+    <w:p>
+      <w:pPr/>
+      <w:r>
+        <w:t>Conclus?o da parte funcional que faltava para o MVP, com agenda de encontros, coment?rios simples e navega??o integrada entre livros, clube e discuss?es.</w:t>
+      </w:r>
+    </w:p>
+    <w:p>
+      <w:pPr/>
+      <w:r>
+        <w:t>Semana 14 (18/05 ? 24/05)</w:t>
+      </w:r>
+    </w:p>
+    <w:p>
+      <w:pPr/>
+      <w:r>
+        <w:t>Total de Horas Dedicadas: 16 horas</w:t>
+      </w:r>
+    </w:p>
+    <w:p>
+      <w:pPr/>
+      <w:r>
+        <w:t>Atividades Realizadas:</w:t>
+      </w:r>
+    </w:p>
+    <w:p>
+      <w:pPr/>
+      <w:r>
+        <w:t>Ajustes gerais das funcionalidades implementadas Valida??o dos fluxos principais do MVP Refinamentos de permiss?es e regras de neg?cio Ajustes de interface, mensagens de feedback e estados vazios Revis?o t?cnica com compila??o, lint, build e smoke test local</w:t>
+      </w:r>
+    </w:p>
+    <w:p>
+      <w:pPr/>
+      <w:r>
+        <w:t>Avan?os do projeto:</w:t>
+      </w:r>
+    </w:p>
+    <w:p>
+      <w:pPr/>
+      <w:r>
+        <w:t>Consolida??o do MVP com estabilidade t?cnica e maior coer?ncia de uso, deixando o projeto pronto para iniciar a etapa de testes e prepara??o para deploy.</w:t>
       </w:r>
     </w:p>
     <w:sectPr>

</xml_diff>

<commit_message>
Atualiza recursos de clubes e livros
</commit_message>
<xml_diff>
--- a/docs/academico/Registro de Horas - Projeto de Extensão.docx
+++ b/docs/academico/Registro de Horas - Projeto de Extensão.docx
@@ -2289,8 +2289,33 @@
           <w:rFonts w:ascii="Arial" w:hAnsi="Arial" w:cs="Arial"/>
           <w:lang w:val="pt-BR"/>
         </w:rPr>
-        <w:t xml:space="preserve"> e backend FastAPI</w:t>
-      </w:r>
+        <w:t xml:space="preserve"> e </w:t>
+      </w:r>
+      <w:proofErr w:type="spellStart"/>
+      <w:r>
+        <w:rPr>
+          <w:rFonts w:ascii="Arial" w:hAnsi="Arial" w:cs="Arial"/>
+          <w:lang w:val="pt-BR"/>
+        </w:rPr>
+        <w:t>backend</w:t>
+      </w:r>
+      <w:proofErr w:type="spellEnd"/>
+      <w:r>
+        <w:rPr>
+          <w:rFonts w:ascii="Arial" w:hAnsi="Arial" w:cs="Arial"/>
+          <w:lang w:val="pt-BR"/>
+        </w:rPr>
+        <w:t xml:space="preserve"> </w:t>
+      </w:r>
+      <w:proofErr w:type="spellStart"/>
+      <w:r>
+        <w:rPr>
+          <w:rFonts w:ascii="Arial" w:hAnsi="Arial" w:cs="Arial"/>
+          <w:lang w:val="pt-BR"/>
+        </w:rPr>
+        <w:t>FastAPI</w:t>
+      </w:r>
+      <w:proofErr w:type="spellEnd"/>
     </w:p>
     <w:p>
       <w:pPr>
@@ -3190,75 +3215,755 @@
       </w:r>
     </w:p>
     <w:p>
-      <w:pPr/>
-      <w:r>
-        <w:t>Semana 13 (11/05 ? 17/05)</w:t>
-      </w:r>
-    </w:p>
-    <w:p>
-      <w:pPr/>
-      <w:r>
+      <w:pPr>
+        <w:spacing w:after="0"/>
+        <w:rPr>
+          <w:rFonts w:ascii="Arial" w:hAnsi="Arial" w:cs="Arial"/>
+          <w:lang w:val="pt-BR"/>
+        </w:rPr>
+      </w:pPr>
+    </w:p>
+    <w:p>
+      <w:pPr>
+        <w:spacing w:after="0"/>
+        <w:rPr>
+          <w:rFonts w:ascii="Arial" w:hAnsi="Arial" w:cs="Arial"/>
+          <w:b/>
+          <w:bCs/>
+          <w:lang w:val="pt-BR"/>
+        </w:rPr>
+      </w:pPr>
+      <w:r>
+        <w:rPr>
+          <w:rFonts w:ascii="Arial" w:hAnsi="Arial" w:cs="Arial"/>
+          <w:b/>
+          <w:bCs/>
+          <w:lang w:val="pt-BR"/>
+        </w:rPr>
+        <w:t xml:space="preserve">Semana 13 (11/05 </w:t>
+      </w:r>
+      <w:r>
+        <w:rPr>
+          <w:rFonts w:ascii="Arial" w:hAnsi="Arial" w:cs="Arial"/>
+          <w:b/>
+          <w:bCs/>
+          <w:lang w:val="pt-BR"/>
+        </w:rPr>
+        <w:t>-</w:t>
+      </w:r>
+      <w:r>
+        <w:rPr>
+          <w:rFonts w:ascii="Arial" w:hAnsi="Arial" w:cs="Arial"/>
+          <w:b/>
+          <w:bCs/>
+          <w:lang w:val="pt-BR"/>
+        </w:rPr>
+        <w:t xml:space="preserve"> 17/05)</w:t>
+      </w:r>
+    </w:p>
+    <w:p>
+      <w:pPr>
+        <w:rPr>
+          <w:lang w:val="pt-BR"/>
+        </w:rPr>
+      </w:pPr>
+      <w:r>
+        <w:rPr>
+          <w:lang w:val="pt-BR"/>
+        </w:rPr>
         <w:t>Total de Horas Dedicadas: 18 horas</w:t>
       </w:r>
     </w:p>
     <w:p>
-      <w:pPr/>
-      <w:r>
+      <w:pPr>
+        <w:rPr>
+          <w:lang w:val="pt-BR"/>
+        </w:rPr>
+      </w:pPr>
+      <w:r>
+        <w:rPr>
+          <w:rFonts w:ascii="Arial" w:hAnsi="Arial" w:cs="Arial"/>
+          <w:b/>
+          <w:bCs/>
+          <w:lang w:val="pt-BR"/>
+        </w:rPr>
         <w:t>Atividades Realizadas:</w:t>
       </w:r>
     </w:p>
     <w:p>
-      <w:pPr/>
-      <w:r>
-        <w:t>Implementa??o do m?dulo de encontros Cria??o e listagem de encontros por clube Estrutura??o do v?nculo entre encontro e livro Implementa??o do sistema de coment?rios simples para livros e encontros Integra??o entre detalhes do clube, detalhes do livro e ?rea de encontros</w:t>
-      </w:r>
-    </w:p>
-    <w:p>
-      <w:pPr/>
-      <w:r>
-        <w:t>Avan?os do projeto:</w:t>
-      </w:r>
-    </w:p>
-    <w:p>
-      <w:pPr/>
-      <w:r>
-        <w:t>Conclus?o da parte funcional que faltava para o MVP, com agenda de encontros, coment?rios simples e navega??o integrada entre livros, clube e discuss?es.</w:t>
-      </w:r>
-    </w:p>
-    <w:p>
-      <w:pPr/>
-      <w:r>
-        <w:t>Semana 14 (18/05 ? 24/05)</w:t>
-      </w:r>
-    </w:p>
-    <w:p>
-      <w:pPr/>
-      <w:r>
+      <w:pPr>
+        <w:rPr>
+          <w:lang w:val="pt-BR"/>
+        </w:rPr>
+      </w:pPr>
+      <w:r>
+        <w:rPr>
+          <w:lang w:val="pt-BR"/>
+        </w:rPr>
+        <w:t>Implementa</w:t>
+      </w:r>
+      <w:r>
+        <w:rPr>
+          <w:lang w:val="pt-BR"/>
+        </w:rPr>
+        <w:t>çã</w:t>
+      </w:r>
+      <w:r>
+        <w:rPr>
+          <w:lang w:val="pt-BR"/>
+        </w:rPr>
+        <w:t>o do m</w:t>
+      </w:r>
+      <w:r>
+        <w:rPr>
+          <w:lang w:val="pt-BR"/>
+        </w:rPr>
+        <w:t>ó</w:t>
+      </w:r>
+      <w:r>
+        <w:rPr>
+          <w:lang w:val="pt-BR"/>
+        </w:rPr>
+        <w:t xml:space="preserve">dulo de encontros </w:t>
+      </w:r>
+    </w:p>
+    <w:p>
+      <w:pPr>
+        <w:rPr>
+          <w:lang w:val="pt-BR"/>
+        </w:rPr>
+      </w:pPr>
+      <w:r>
+        <w:rPr>
+          <w:lang w:val="pt-BR"/>
+        </w:rPr>
+        <w:t>Cria</w:t>
+      </w:r>
+      <w:r>
+        <w:rPr>
+          <w:lang w:val="pt-BR"/>
+        </w:rPr>
+        <w:t>çã</w:t>
+      </w:r>
+      <w:r>
+        <w:rPr>
+          <w:lang w:val="pt-BR"/>
+        </w:rPr>
+        <w:t xml:space="preserve">o e listagem de encontros por clube </w:t>
+      </w:r>
+    </w:p>
+    <w:p>
+      <w:pPr>
+        <w:rPr>
+          <w:lang w:val="pt-BR"/>
+        </w:rPr>
+      </w:pPr>
+      <w:r>
+        <w:rPr>
+          <w:lang w:val="pt-BR"/>
+        </w:rPr>
+        <w:t>Estrutura</w:t>
+      </w:r>
+      <w:r>
+        <w:rPr>
+          <w:lang w:val="pt-BR"/>
+        </w:rPr>
+        <w:t>çã</w:t>
+      </w:r>
+      <w:r>
+        <w:rPr>
+          <w:lang w:val="pt-BR"/>
+        </w:rPr>
+        <w:t>o do v</w:t>
+      </w:r>
+      <w:r>
+        <w:rPr>
+          <w:lang w:val="pt-BR"/>
+        </w:rPr>
+        <w:t>í</w:t>
+      </w:r>
+      <w:r>
+        <w:rPr>
+          <w:lang w:val="pt-BR"/>
+        </w:rPr>
+        <w:t xml:space="preserve">nculo entre encontro e livro </w:t>
+      </w:r>
+    </w:p>
+    <w:p>
+      <w:pPr>
+        <w:rPr>
+          <w:lang w:val="pt-BR"/>
+        </w:rPr>
+      </w:pPr>
+      <w:r>
+        <w:rPr>
+          <w:lang w:val="pt-BR"/>
+        </w:rPr>
+        <w:t>Implementa</w:t>
+      </w:r>
+      <w:r>
+        <w:rPr>
+          <w:lang w:val="pt-BR"/>
+        </w:rPr>
+        <w:t>çã</w:t>
+      </w:r>
+      <w:r>
+        <w:rPr>
+          <w:lang w:val="pt-BR"/>
+        </w:rPr>
+        <w:t>o do sistema de coment</w:t>
+      </w:r>
+      <w:r>
+        <w:rPr>
+          <w:lang w:val="pt-BR"/>
+        </w:rPr>
+        <w:t>á</w:t>
+      </w:r>
+      <w:r>
+        <w:rPr>
+          <w:lang w:val="pt-BR"/>
+        </w:rPr>
+        <w:t xml:space="preserve">rios simples para livros e encontros </w:t>
+      </w:r>
+    </w:p>
+    <w:p>
+      <w:pPr>
+        <w:rPr>
+          <w:lang w:val="pt-BR"/>
+        </w:rPr>
+      </w:pPr>
+      <w:r>
+        <w:rPr>
+          <w:lang w:val="pt-BR"/>
+        </w:rPr>
+        <w:t>Integra</w:t>
+      </w:r>
+      <w:r>
+        <w:rPr>
+          <w:lang w:val="pt-BR"/>
+        </w:rPr>
+        <w:t>çã</w:t>
+      </w:r>
+      <w:r>
+        <w:rPr>
+          <w:lang w:val="pt-BR"/>
+        </w:rPr>
+        <w:t xml:space="preserve">o entre detalhes do clube, detalhes do livro e </w:t>
+      </w:r>
+      <w:r>
+        <w:rPr>
+          <w:lang w:val="pt-BR"/>
+        </w:rPr>
+        <w:t>á</w:t>
+      </w:r>
+      <w:r>
+        <w:rPr>
+          <w:lang w:val="pt-BR"/>
+        </w:rPr>
+        <w:t>rea de encontros</w:t>
+      </w:r>
+    </w:p>
+    <w:p>
+      <w:pPr>
+        <w:spacing w:after="0"/>
+        <w:rPr>
+          <w:rFonts w:ascii="Arial" w:hAnsi="Arial" w:cs="Arial"/>
+          <w:b/>
+          <w:bCs/>
+          <w:lang w:val="pt-BR"/>
+        </w:rPr>
+      </w:pPr>
+      <w:r>
+        <w:rPr>
+          <w:rFonts w:ascii="Arial" w:hAnsi="Arial" w:cs="Arial"/>
+          <w:b/>
+          <w:bCs/>
+          <w:lang w:val="pt-BR"/>
+        </w:rPr>
+        <w:lastRenderedPageBreak/>
+        <w:t>Avan</w:t>
+      </w:r>
+      <w:r>
+        <w:rPr>
+          <w:rFonts w:ascii="Arial" w:hAnsi="Arial" w:cs="Arial"/>
+          <w:b/>
+          <w:bCs/>
+          <w:lang w:val="pt-BR"/>
+        </w:rPr>
+        <w:t>ç</w:t>
+      </w:r>
+      <w:r>
+        <w:rPr>
+          <w:rFonts w:ascii="Arial" w:hAnsi="Arial" w:cs="Arial"/>
+          <w:b/>
+          <w:bCs/>
+          <w:lang w:val="pt-BR"/>
+        </w:rPr>
+        <w:t>os do projeto:</w:t>
+      </w:r>
+    </w:p>
+    <w:p>
+      <w:pPr>
+        <w:rPr>
+          <w:lang w:val="pt-BR"/>
+        </w:rPr>
+      </w:pPr>
+      <w:r>
+        <w:rPr>
+          <w:lang w:val="pt-BR"/>
+        </w:rPr>
+        <w:t>Conclus</w:t>
+      </w:r>
+      <w:r>
+        <w:rPr>
+          <w:lang w:val="pt-BR"/>
+        </w:rPr>
+        <w:t>ã</w:t>
+      </w:r>
+      <w:r>
+        <w:rPr>
+          <w:lang w:val="pt-BR"/>
+        </w:rPr>
+        <w:t>o da parte funcional que faltava para o MVP, com agenda de encontros, coment</w:t>
+      </w:r>
+      <w:r>
+        <w:rPr>
+          <w:lang w:val="pt-BR"/>
+        </w:rPr>
+        <w:t>á</w:t>
+      </w:r>
+      <w:r>
+        <w:rPr>
+          <w:lang w:val="pt-BR"/>
+        </w:rPr>
+        <w:t>rios simples e navega</w:t>
+      </w:r>
+      <w:r>
+        <w:rPr>
+          <w:lang w:val="pt-BR"/>
+        </w:rPr>
+        <w:t>çã</w:t>
+      </w:r>
+      <w:r>
+        <w:rPr>
+          <w:lang w:val="pt-BR"/>
+        </w:rPr>
+        <w:t>o integrada entre livros, clube e discuss</w:t>
+      </w:r>
+      <w:r>
+        <w:rPr>
+          <w:lang w:val="pt-BR"/>
+        </w:rPr>
+        <w:t>õ</w:t>
+      </w:r>
+      <w:r>
+        <w:rPr>
+          <w:lang w:val="pt-BR"/>
+        </w:rPr>
+        <w:t>es.</w:t>
+      </w:r>
+    </w:p>
+    <w:p>
+      <w:pPr>
+        <w:rPr>
+          <w:lang w:val="pt-BR"/>
+        </w:rPr>
+      </w:pPr>
+    </w:p>
+    <w:p>
+      <w:pPr>
+        <w:spacing w:after="0"/>
+        <w:rPr>
+          <w:rFonts w:ascii="Arial" w:hAnsi="Arial" w:cs="Arial"/>
+          <w:b/>
+          <w:bCs/>
+          <w:lang w:val="pt-BR"/>
+        </w:rPr>
+      </w:pPr>
+      <w:r>
+        <w:rPr>
+          <w:rFonts w:ascii="Arial" w:hAnsi="Arial" w:cs="Arial"/>
+          <w:b/>
+          <w:bCs/>
+          <w:lang w:val="pt-BR"/>
+        </w:rPr>
+        <w:t xml:space="preserve">Semana 14 (18/05 </w:t>
+      </w:r>
+      <w:r>
+        <w:rPr>
+          <w:rFonts w:ascii="Arial" w:hAnsi="Arial" w:cs="Arial"/>
+          <w:b/>
+          <w:bCs/>
+          <w:lang w:val="pt-BR"/>
+        </w:rPr>
+        <w:t>-</w:t>
+      </w:r>
+      <w:r>
+        <w:rPr>
+          <w:rFonts w:ascii="Arial" w:hAnsi="Arial" w:cs="Arial"/>
+          <w:b/>
+          <w:bCs/>
+          <w:lang w:val="pt-BR"/>
+        </w:rPr>
+        <w:t xml:space="preserve"> 24/05)</w:t>
+      </w:r>
+    </w:p>
+    <w:p>
+      <w:pPr>
+        <w:spacing w:after="0"/>
+        <w:rPr>
+          <w:rFonts w:ascii="Arial" w:hAnsi="Arial" w:cs="Arial"/>
+          <w:b/>
+          <w:bCs/>
+          <w:lang w:val="pt-BR"/>
+        </w:rPr>
+      </w:pPr>
+    </w:p>
+    <w:p>
+      <w:pPr>
+        <w:rPr>
+          <w:lang w:val="pt-BR"/>
+        </w:rPr>
+      </w:pPr>
+      <w:r>
+        <w:rPr>
+          <w:lang w:val="pt-BR"/>
+        </w:rPr>
         <w:t>Total de Horas Dedicadas: 16 horas</w:t>
       </w:r>
     </w:p>
     <w:p>
-      <w:pPr/>
-      <w:r>
+      <w:pPr>
+        <w:spacing w:after="0"/>
+        <w:rPr>
+          <w:rFonts w:ascii="Arial" w:hAnsi="Arial" w:cs="Arial"/>
+          <w:b/>
+          <w:bCs/>
+          <w:lang w:val="pt-BR"/>
+        </w:rPr>
+      </w:pPr>
+      <w:r>
+        <w:rPr>
+          <w:rFonts w:ascii="Arial" w:hAnsi="Arial" w:cs="Arial"/>
+          <w:b/>
+          <w:bCs/>
+          <w:lang w:val="pt-BR"/>
+        </w:rPr>
         <w:t>Atividades Realizadas:</w:t>
       </w:r>
     </w:p>
     <w:p>
-      <w:pPr/>
-      <w:r>
-        <w:t>Ajustes gerais das funcionalidades implementadas Valida??o dos fluxos principais do MVP Refinamentos de permiss?es e regras de neg?cio Ajustes de interface, mensagens de feedback e estados vazios Revis?o t?cnica com compila??o, lint, build e smoke test local</w:t>
-      </w:r>
-    </w:p>
-    <w:p>
-      <w:pPr/>
-      <w:r>
-        <w:t>Avan?os do projeto:</w:t>
-      </w:r>
-    </w:p>
-    <w:p>
-      <w:pPr/>
-      <w:r>
-        <w:t>Consolida??o do MVP com estabilidade t?cnica e maior coer?ncia de uso, deixando o projeto pronto para iniciar a etapa de testes e prepara??o para deploy.</w:t>
+      <w:pPr>
+        <w:spacing w:after="0"/>
+        <w:rPr>
+          <w:rFonts w:ascii="Arial" w:hAnsi="Arial" w:cs="Arial"/>
+          <w:b/>
+          <w:bCs/>
+          <w:lang w:val="pt-BR"/>
+        </w:rPr>
+      </w:pPr>
+    </w:p>
+    <w:p>
+      <w:pPr>
+        <w:rPr>
+          <w:lang w:val="pt-BR"/>
+        </w:rPr>
+      </w:pPr>
+      <w:r>
+        <w:rPr>
+          <w:lang w:val="pt-BR"/>
+        </w:rPr>
+        <w:t xml:space="preserve">Ajustes gerais das funcionalidades implementadas </w:t>
+      </w:r>
+    </w:p>
+    <w:p>
+      <w:pPr>
+        <w:rPr>
+          <w:lang w:val="pt-BR"/>
+        </w:rPr>
+      </w:pPr>
+      <w:r>
+        <w:rPr>
+          <w:lang w:val="pt-BR"/>
+        </w:rPr>
+        <w:t>Valida</w:t>
+      </w:r>
+      <w:r>
+        <w:rPr>
+          <w:lang w:val="pt-BR"/>
+        </w:rPr>
+        <w:t>çã</w:t>
+      </w:r>
+      <w:r>
+        <w:rPr>
+          <w:lang w:val="pt-BR"/>
+        </w:rPr>
+        <w:t xml:space="preserve">o dos fluxos principais do MVP </w:t>
+      </w:r>
+    </w:p>
+    <w:p>
+      <w:pPr>
+        <w:rPr>
+          <w:lang w:val="pt-BR"/>
+        </w:rPr>
+      </w:pPr>
+      <w:r>
+        <w:rPr>
+          <w:lang w:val="pt-BR"/>
+        </w:rPr>
+        <w:t>Refinamentos de permiss</w:t>
+      </w:r>
+      <w:r>
+        <w:rPr>
+          <w:lang w:val="pt-BR"/>
+        </w:rPr>
+        <w:t>õ</w:t>
+      </w:r>
+      <w:r>
+        <w:rPr>
+          <w:lang w:val="pt-BR"/>
+        </w:rPr>
+        <w:t>es e regras de neg</w:t>
+      </w:r>
+      <w:r>
+        <w:rPr>
+          <w:lang w:val="pt-BR"/>
+        </w:rPr>
+        <w:t>ó</w:t>
+      </w:r>
+      <w:r>
+        <w:rPr>
+          <w:lang w:val="pt-BR"/>
+        </w:rPr>
+        <w:t xml:space="preserve">cio </w:t>
+      </w:r>
+    </w:p>
+    <w:p>
+      <w:pPr>
+        <w:rPr>
+          <w:lang w:val="pt-BR"/>
+        </w:rPr>
+      </w:pPr>
+      <w:r>
+        <w:rPr>
+          <w:lang w:val="pt-BR"/>
+        </w:rPr>
+        <w:t xml:space="preserve">Ajustes de interface, mensagens de feedback e estados vazios </w:t>
+      </w:r>
+    </w:p>
+    <w:p>
+      <w:pPr>
+        <w:rPr>
+          <w:lang w:val="pt-BR"/>
+        </w:rPr>
+      </w:pPr>
+      <w:r>
+        <w:rPr>
+          <w:lang w:val="pt-BR"/>
+        </w:rPr>
+        <w:t>Revis</w:t>
+      </w:r>
+      <w:r>
+        <w:rPr>
+          <w:lang w:val="pt-BR"/>
+        </w:rPr>
+        <w:t>ã</w:t>
+      </w:r>
+      <w:r>
+        <w:rPr>
+          <w:lang w:val="pt-BR"/>
+        </w:rPr>
+        <w:t>o t</w:t>
+      </w:r>
+      <w:r>
+        <w:rPr>
+          <w:lang w:val="pt-BR"/>
+        </w:rPr>
+        <w:t>é</w:t>
+      </w:r>
+      <w:r>
+        <w:rPr>
+          <w:lang w:val="pt-BR"/>
+        </w:rPr>
+        <w:t>cnica com compila</w:t>
+      </w:r>
+      <w:r>
+        <w:rPr>
+          <w:lang w:val="pt-BR"/>
+        </w:rPr>
+        <w:t>çã</w:t>
+      </w:r>
+      <w:r>
+        <w:rPr>
+          <w:lang w:val="pt-BR"/>
+        </w:rPr>
+        <w:t xml:space="preserve">o, </w:t>
+      </w:r>
+      <w:proofErr w:type="spellStart"/>
+      <w:r>
+        <w:rPr>
+          <w:lang w:val="pt-BR"/>
+        </w:rPr>
+        <w:t>lint</w:t>
+      </w:r>
+      <w:proofErr w:type="spellEnd"/>
+      <w:r>
+        <w:rPr>
+          <w:lang w:val="pt-BR"/>
+        </w:rPr>
+        <w:t xml:space="preserve">, build e </w:t>
+      </w:r>
+      <w:proofErr w:type="spellStart"/>
+      <w:r>
+        <w:rPr>
+          <w:lang w:val="pt-BR"/>
+        </w:rPr>
+        <w:t>smoke</w:t>
+      </w:r>
+      <w:proofErr w:type="spellEnd"/>
+      <w:r>
+        <w:rPr>
+          <w:lang w:val="pt-BR"/>
+        </w:rPr>
+        <w:t xml:space="preserve"> </w:t>
+      </w:r>
+      <w:proofErr w:type="spellStart"/>
+      <w:r>
+        <w:rPr>
+          <w:lang w:val="pt-BR"/>
+        </w:rPr>
+        <w:t>test</w:t>
+      </w:r>
+      <w:proofErr w:type="spellEnd"/>
+      <w:r>
+        <w:rPr>
+          <w:lang w:val="pt-BR"/>
+        </w:rPr>
+        <w:t xml:space="preserve"> local</w:t>
+      </w:r>
+    </w:p>
+    <w:p>
+      <w:pPr>
+        <w:spacing w:after="0"/>
+        <w:rPr>
+          <w:rFonts w:ascii="Arial" w:hAnsi="Arial" w:cs="Arial"/>
+          <w:b/>
+          <w:bCs/>
+          <w:lang w:val="pt-BR"/>
+        </w:rPr>
+      </w:pPr>
+      <w:r>
+        <w:rPr>
+          <w:rFonts w:ascii="Arial" w:hAnsi="Arial" w:cs="Arial"/>
+          <w:b/>
+          <w:bCs/>
+          <w:lang w:val="pt-BR"/>
+        </w:rPr>
+        <w:t>Avan</w:t>
+      </w:r>
+      <w:r>
+        <w:rPr>
+          <w:rFonts w:ascii="Arial" w:hAnsi="Arial" w:cs="Arial"/>
+          <w:b/>
+          <w:bCs/>
+          <w:lang w:val="pt-BR"/>
+        </w:rPr>
+        <w:t>ç</w:t>
+      </w:r>
+      <w:r>
+        <w:rPr>
+          <w:rFonts w:ascii="Arial" w:hAnsi="Arial" w:cs="Arial"/>
+          <w:b/>
+          <w:bCs/>
+          <w:lang w:val="pt-BR"/>
+        </w:rPr>
+        <w:t>os do projeto:</w:t>
+      </w:r>
+    </w:p>
+    <w:p>
+      <w:pPr>
+        <w:spacing w:after="0"/>
+        <w:rPr>
+          <w:rFonts w:ascii="Arial" w:hAnsi="Arial" w:cs="Arial"/>
+          <w:b/>
+          <w:bCs/>
+          <w:lang w:val="pt-BR"/>
+        </w:rPr>
+      </w:pPr>
+    </w:p>
+    <w:p>
+      <w:pPr>
+        <w:rPr>
+          <w:lang w:val="pt-BR"/>
+        </w:rPr>
+      </w:pPr>
+      <w:r>
+        <w:rPr>
+          <w:lang w:val="pt-BR"/>
+        </w:rPr>
+        <w:t>Consolida</w:t>
+      </w:r>
+      <w:r>
+        <w:rPr>
+          <w:lang w:val="pt-BR"/>
+        </w:rPr>
+        <w:t>çã</w:t>
+      </w:r>
+      <w:r>
+        <w:rPr>
+          <w:lang w:val="pt-BR"/>
+        </w:rPr>
+        <w:t>o do MVP com estabilidade t</w:t>
+      </w:r>
+      <w:r>
+        <w:rPr>
+          <w:lang w:val="pt-BR"/>
+        </w:rPr>
+        <w:t>é</w:t>
+      </w:r>
+      <w:r>
+        <w:rPr>
+          <w:lang w:val="pt-BR"/>
+        </w:rPr>
+        <w:t>cnica e maior coer</w:t>
+      </w:r>
+      <w:r>
+        <w:rPr>
+          <w:lang w:val="pt-BR"/>
+        </w:rPr>
+        <w:t>ê</w:t>
+      </w:r>
+      <w:r>
+        <w:rPr>
+          <w:lang w:val="pt-BR"/>
+        </w:rPr>
+        <w:t>ncia de uso, deixando o projeto pronto para iniciar a etapa de testes e prepara</w:t>
+      </w:r>
+      <w:r>
+        <w:rPr>
+          <w:lang w:val="pt-BR"/>
+        </w:rPr>
+        <w:t>çã</w:t>
+      </w:r>
+      <w:r>
+        <w:rPr>
+          <w:lang w:val="pt-BR"/>
+        </w:rPr>
+        <w:t xml:space="preserve">o para </w:t>
+      </w:r>
+      <w:proofErr w:type="spellStart"/>
+      <w:r>
+        <w:rPr>
+          <w:lang w:val="pt-BR"/>
+        </w:rPr>
+        <w:t>deploy</w:t>
+      </w:r>
+      <w:proofErr w:type="spellEnd"/>
+      <w:r>
+        <w:rPr>
+          <w:lang w:val="pt-BR"/>
+        </w:rPr>
+        <w:t>.</w:t>
       </w:r>
     </w:p>
     <w:sectPr>

</xml_diff>

<commit_message>
Finaliza entrega do projeto das semanas 15 a 17
</commit_message>
<xml_diff>
--- a/docs/academico/Registro de Horas - Projeto de Extensão.docx
+++ b/docs/academico/Registro de Horas - Projeto de Extensão.docx
@@ -3964,6 +3964,321 @@
           <w:lang w:val="pt-BR"/>
         </w:rPr>
         <w:t>.</w:t>
+      </w:r>
+    </w:p>
+    <w:p>
+      <w:pPr>
+        <w:spacing w:after="0"/>
+      </w:pPr>
+    </w:p>
+    <w:p>
+      <w:pPr>
+        <w:spacing w:after="0"/>
+      </w:pPr>
+      <w:r>
+        <w:rPr>
+          <w:rFonts w:ascii="Arial" w:hAnsi="Arial"/>
+          <w:b/>
+        </w:rPr>
+        <w:t>Semana 15 (25/05 - 31/05)</w:t>
+      </w:r>
+    </w:p>
+    <w:p>
+      <w:pPr>
+        <w:spacing w:after="0"/>
+      </w:pPr>
+    </w:p>
+    <w:p>
+      <w:pPr/>
+      <w:r>
+        <w:rPr/>
+        <w:t>Total de Horas Dedicadas: 16 horas</w:t>
+      </w:r>
+    </w:p>
+    <w:p>
+      <w:pPr>
+        <w:spacing w:after="0"/>
+      </w:pPr>
+      <w:r>
+        <w:rPr>
+          <w:rFonts w:ascii="Arial" w:hAnsi="Arial"/>
+          <w:b/>
+        </w:rPr>
+        <w:t>Atividades Realizadas:</w:t>
+      </w:r>
+    </w:p>
+    <w:p>
+      <w:pPr>
+        <w:spacing w:after="0"/>
+      </w:pPr>
+    </w:p>
+    <w:p>
+      <w:pPr/>
+      <w:r>
+        <w:rPr/>
+        <w:t>Testes funcionais dos fluxos principais do MVP</w:t>
+      </w:r>
+    </w:p>
+    <w:p>
+      <w:pPr/>
+      <w:r>
+        <w:rPr/>
+        <w:t>Normalização de entradas, e-mail e tratamento de campos em branco</w:t>
+      </w:r>
+    </w:p>
+    <w:p>
+      <w:pPr/>
+      <w:r>
+        <w:rPr/>
+        <w:t>Revisão de segurança com reforço do hash de senha e expiração de token</w:t>
+      </w:r>
+    </w:p>
+    <w:p>
+      <w:pPr/>
+      <w:r>
+        <w:rPr/>
+        <w:t>Correção de bugs no frontend e ajuste do módulo de encontros</w:t>
+      </w:r>
+    </w:p>
+    <w:p>
+      <w:pPr/>
+      <w:r>
+        <w:rPr/>
+        <w:t>Criação de testes automatizados para a camada de serviços do backend</w:t>
+      </w:r>
+    </w:p>
+    <w:p>
+      <w:pPr>
+        <w:spacing w:after="0"/>
+      </w:pPr>
+      <w:r>
+        <w:rPr>
+          <w:rFonts w:ascii="Arial" w:hAnsi="Arial"/>
+          <w:b/>
+        </w:rPr>
+        <w:t>Avanços do projeto:</w:t>
+      </w:r>
+    </w:p>
+    <w:p>
+      <w:pPr>
+        <w:spacing w:after="0"/>
+      </w:pPr>
+    </w:p>
+    <w:p>
+      <w:pPr/>
+      <w:r>
+        <w:rPr/>
+        <w:t>Fortalecimento da confiabilidade do MVP, com regras mais robustas, correções técnicas relevantes e validação automatizada das funcionalidades centrais do sistema.</w:t>
+      </w:r>
+    </w:p>
+    <w:p>
+      <w:pPr>
+        <w:spacing w:after="0"/>
+      </w:pPr>
+    </w:p>
+    <w:p>
+      <w:pPr>
+        <w:spacing w:after="0"/>
+      </w:pPr>
+      <w:r>
+        <w:rPr>
+          <w:rFonts w:ascii="Arial" w:hAnsi="Arial"/>
+          <w:b/>
+        </w:rPr>
+        <w:t>Semana 16 (01/06 - 07/06)</w:t>
+      </w:r>
+    </w:p>
+    <w:p>
+      <w:pPr>
+        <w:spacing w:after="0"/>
+      </w:pPr>
+    </w:p>
+    <w:p>
+      <w:pPr/>
+      <w:r>
+        <w:rPr/>
+        <w:t>Total de Horas Dedicadas: 15 horas</w:t>
+      </w:r>
+    </w:p>
+    <w:p>
+      <w:pPr>
+        <w:spacing w:after="0"/>
+      </w:pPr>
+      <w:r>
+        <w:rPr>
+          <w:rFonts w:ascii="Arial" w:hAnsi="Arial"/>
+          <w:b/>
+        </w:rPr>
+        <w:t>Atividades Realizadas:</w:t>
+      </w:r>
+    </w:p>
+    <w:p>
+      <w:pPr>
+        <w:spacing w:after="0"/>
+      </w:pPr>
+    </w:p>
+    <w:p>
+      <w:pPr/>
+      <w:r>
+        <w:rPr/>
+        <w:t>Preparação de artefatos de deploy com Dockerfiles e docker-compose alinhados ao projeto real</w:t>
+      </w:r>
+    </w:p>
+    <w:p>
+      <w:pPr/>
+      <w:r>
+        <w:rPr/>
+        <w:t>Configuração de variáveis de ambiente do backend e do frontend</w:t>
+      </w:r>
+    </w:p>
+    <w:p>
+      <w:pPr/>
+      <w:r>
+        <w:rPr/>
+        <w:t>Atualização do requirements.txt e revisão dos arquivos de execução</w:t>
+      </w:r>
+    </w:p>
+    <w:p>
+      <w:pPr/>
+      <w:r>
+        <w:rPr/>
+        <w:t>Ampliação da documentação técnica com README revisado e documento complementar</w:t>
+      </w:r>
+    </w:p>
+    <w:p>
+      <w:pPr/>
+      <w:r>
+        <w:rPr/>
+        <w:t>Organização final da estrutura de entrega do repositório</w:t>
+      </w:r>
+    </w:p>
+    <w:p>
+      <w:pPr>
+        <w:spacing w:after="0"/>
+      </w:pPr>
+      <w:r>
+        <w:rPr>
+          <w:rFonts w:ascii="Arial" w:hAnsi="Arial"/>
+          <w:b/>
+        </w:rPr>
+        <w:t>Avanços do projeto:</w:t>
+      </w:r>
+    </w:p>
+    <w:p>
+      <w:pPr>
+        <w:spacing w:after="0"/>
+      </w:pPr>
+    </w:p>
+    <w:p>
+      <w:pPr/>
+      <w:r>
+        <w:rPr/>
+        <w:t>Preparação do projeto para execução reproduzível e entrega técnica coerente, com documentação, configuração e empacotamento compatíveis com a implementação final do MVP.</w:t>
+      </w:r>
+    </w:p>
+    <w:p>
+      <w:pPr>
+        <w:spacing w:after="0"/>
+      </w:pPr>
+    </w:p>
+    <w:p>
+      <w:pPr>
+        <w:spacing w:after="0"/>
+      </w:pPr>
+      <w:r>
+        <w:rPr>
+          <w:rFonts w:ascii="Arial" w:hAnsi="Arial"/>
+          <w:b/>
+        </w:rPr>
+        <w:t>Semana 17 (08/06 - 14/06)</w:t>
+      </w:r>
+    </w:p>
+    <w:p>
+      <w:pPr>
+        <w:spacing w:after="0"/>
+      </w:pPr>
+    </w:p>
+    <w:p>
+      <w:pPr/>
+      <w:r>
+        <w:rPr/>
+        <w:t>Total de Horas Dedicadas: 12 horas</w:t>
+      </w:r>
+    </w:p>
+    <w:p>
+      <w:pPr>
+        <w:spacing w:after="0"/>
+      </w:pPr>
+      <w:r>
+        <w:rPr>
+          <w:rFonts w:ascii="Arial" w:hAnsi="Arial"/>
+          <w:b/>
+        </w:rPr>
+        <w:t>Atividades Realizadas:</w:t>
+      </w:r>
+    </w:p>
+    <w:p>
+      <w:pPr>
+        <w:spacing w:after="0"/>
+      </w:pPr>
+    </w:p>
+    <w:p>
+      <w:pPr/>
+      <w:r>
+        <w:rPr/>
+        <w:t>Preenchimento da documentação acadêmica final do projeto</w:t>
+      </w:r>
+    </w:p>
+    <w:p>
+      <w:pPr/>
+      <w:r>
+        <w:rPr/>
+        <w:t>Atualização do Projeto de Extensão com as semanas 15, 16 e 17</w:t>
+      </w:r>
+    </w:p>
+    <w:p>
+      <w:pPr/>
+      <w:r>
+        <w:rPr/>
+        <w:t>Atualização do Registro de Horas e revisão final dos documentos</w:t>
+      </w:r>
+    </w:p>
+    <w:p>
+      <w:pPr/>
+      <w:r>
+        <w:rPr/>
+        <w:t>Organização das evidências e artefatos produzidos ao longo do semestre</w:t>
+      </w:r>
+    </w:p>
+    <w:p>
+      <w:pPr/>
+      <w:r>
+        <w:rPr/>
+        <w:t>Conferência final do material de entrega</w:t>
+      </w:r>
+    </w:p>
+    <w:p>
+      <w:pPr>
+        <w:spacing w:after="0"/>
+      </w:pPr>
+      <w:r>
+        <w:rPr>
+          <w:rFonts w:ascii="Arial" w:hAnsi="Arial"/>
+          <w:b/>
+        </w:rPr>
+        <w:t>Avanços do projeto:</w:t>
+      </w:r>
+    </w:p>
+    <w:p>
+      <w:pPr>
+        <w:spacing w:after="0"/>
+      </w:pPr>
+    </w:p>
+    <w:p>
+      <w:pPr/>
+      <w:r>
+        <w:rPr/>
+        <w:t>Encerramento formal do projeto com documentação consolidada, artefatos organizados e material final preparado para submissão acadêmica.</w:t>
       </w:r>
     </w:p>
     <w:sectPr>

</xml_diff>